<commit_message>
Completed Par2, Lesson 3
</commit_message>
<xml_diff>
--- a/Minh chứng/Kết quả phần 2 .docx
+++ b/Minh chứng/Kết quả phần 2 .docx
@@ -383,6 +383,55 @@
           <w:b/>
           <w:bCs/>
         </w:rPr>
+        <w:drawing>
+          <wp:inline distT="0" distB="0" distL="0" distR="0" wp14:anchorId="057EDB78" wp14:editId="127E18E6">
+            <wp:extent cx="5943600" cy="3342005"/>
+            <wp:effectExtent l="0" t="0" r="0" b="0"/>
+            <wp:docPr id="1436030072" name="Picture 1"/>
+            <wp:cNvGraphicFramePr>
+              <a:graphicFrameLocks xmlns:a="http://schemas.openxmlformats.org/drawingml/2006/main" noChangeAspect="1"/>
+            </wp:cNvGraphicFramePr>
+            <a:graphic xmlns:a="http://schemas.openxmlformats.org/drawingml/2006/main">
+              <a:graphicData uri="http://schemas.openxmlformats.org/drawingml/2006/picture">
+                <pic:pic xmlns:pic="http://schemas.openxmlformats.org/drawingml/2006/picture">
+                  <pic:nvPicPr>
+                    <pic:cNvPr id="1436030072" name=""/>
+                    <pic:cNvPicPr/>
+                  </pic:nvPicPr>
+                  <pic:blipFill>
+                    <a:blip r:embed="rId8"/>
+                    <a:stretch>
+                      <a:fillRect/>
+                    </a:stretch>
+                  </pic:blipFill>
+                  <pic:spPr>
+                    <a:xfrm>
+                      <a:off x="0" y="0"/>
+                      <a:ext cx="5943600" cy="3342005"/>
+                    </a:xfrm>
+                    <a:prstGeom prst="rect">
+                      <a:avLst/>
+                    </a:prstGeom>
+                  </pic:spPr>
+                </pic:pic>
+              </a:graphicData>
+            </a:graphic>
+          </wp:inline>
+        </w:drawing>
+      </w:r>
+    </w:p>
+    <w:p>
+      <w:pPr>
+        <w:rPr>
+          <w:b/>
+          <w:bCs/>
+        </w:rPr>
+      </w:pPr>
+      <w:r>
+        <w:rPr>
+          <w:b/>
+          <w:bCs/>
+        </w:rPr>
         <w:t>- Kết quả</w:t>
       </w:r>
     </w:p>
@@ -393,6 +442,115 @@
           <w:bCs/>
         </w:rPr>
       </w:pPr>
+      <w:r>
+        <w:rPr>
+          <w:b/>
+          <w:bCs/>
+        </w:rPr>
+        <w:drawing>
+          <wp:inline distT="0" distB="0" distL="0" distR="0" wp14:anchorId="7B3BB10E" wp14:editId="40728ACE">
+            <wp:extent cx="5943600" cy="3342005"/>
+            <wp:effectExtent l="0" t="0" r="0" b="0"/>
+            <wp:docPr id="1377056756" name="Picture 1"/>
+            <wp:cNvGraphicFramePr>
+              <a:graphicFrameLocks xmlns:a="http://schemas.openxmlformats.org/drawingml/2006/main" noChangeAspect="1"/>
+            </wp:cNvGraphicFramePr>
+            <a:graphic xmlns:a="http://schemas.openxmlformats.org/drawingml/2006/main">
+              <a:graphicData uri="http://schemas.openxmlformats.org/drawingml/2006/picture">
+                <pic:pic xmlns:pic="http://schemas.openxmlformats.org/drawingml/2006/picture">
+                  <pic:nvPicPr>
+                    <pic:cNvPr id="1377056756" name=""/>
+                    <pic:cNvPicPr/>
+                  </pic:nvPicPr>
+                  <pic:blipFill>
+                    <a:blip r:embed="rId9"/>
+                    <a:stretch>
+                      <a:fillRect/>
+                    </a:stretch>
+                  </pic:blipFill>
+                  <pic:spPr>
+                    <a:xfrm>
+                      <a:off x="0" y="0"/>
+                      <a:ext cx="5943600" cy="3342005"/>
+                    </a:xfrm>
+                    <a:prstGeom prst="rect">
+                      <a:avLst/>
+                    </a:prstGeom>
+                  </pic:spPr>
+                </pic:pic>
+              </a:graphicData>
+            </a:graphic>
+          </wp:inline>
+        </w:drawing>
+      </w:r>
+    </w:p>
+    <w:p>
+      <w:pPr>
+        <w:rPr>
+          <w:b/>
+          <w:bCs/>
+        </w:rPr>
+      </w:pPr>
+    </w:p>
+    <w:p>
+      <w:pPr>
+        <w:rPr>
+          <w:b/>
+          <w:bCs/>
+        </w:rPr>
+      </w:pPr>
+      <w:r>
+        <w:rPr>
+          <w:b/>
+          <w:bCs/>
+        </w:rPr>
+        <w:lastRenderedPageBreak/>
+        <w:t xml:space="preserve">Bài </w:t>
+      </w:r>
+      <w:r>
+        <w:rPr>
+          <w:b/>
+          <w:bCs/>
+        </w:rPr>
+        <w:t>4</w:t>
+      </w:r>
+    </w:p>
+    <w:p>
+      <w:pPr>
+        <w:rPr>
+          <w:b/>
+          <w:bCs/>
+        </w:rPr>
+      </w:pPr>
+      <w:r>
+        <w:rPr>
+          <w:b/>
+          <w:bCs/>
+        </w:rPr>
+        <w:t xml:space="preserve">- </w:t>
+      </w:r>
+      <w:r>
+        <w:rPr>
+          <w:b/>
+          <w:bCs/>
+        </w:rPr>
+        <w:t> Khởi động container</w:t>
+      </w:r>
+    </w:p>
+    <w:p>
+      <w:pPr>
+        <w:rPr>
+          <w:b/>
+          <w:bCs/>
+        </w:rPr>
+      </w:pPr>
+      <w:r>
+        <w:rPr>
+          <w:b/>
+          <w:bCs/>
+        </w:rPr>
+        <w:t>- Kết quả</w:t>
+      </w:r>
     </w:p>
     <w:sectPr>
       <w:pgSz w:w="12240" w:h="15840"/>
@@ -804,7 +962,7 @@
   <w:style w:type="paragraph" w:default="1" w:styleId="Normal">
     <w:name w:val="Normal"/>
     <w:qFormat/>
-    <w:rsid w:val="00D04E02"/>
+    <w:rsid w:val="00965DFB"/>
   </w:style>
   <w:style w:type="paragraph" w:styleId="Heading1">
     <w:name w:val="heading 1"/>

</xml_diff>

<commit_message>
Completed Part 2, Lesson 4
</commit_message>
<xml_diff>
--- a/Minh chứng/Kết quả phần 2 .docx
+++ b/Minh chứng/Kết quả phần 2 .docx
@@ -549,7 +549,105 @@
           <w:b/>
           <w:bCs/>
         </w:rPr>
+        <w:drawing>
+          <wp:inline distT="0" distB="0" distL="0" distR="0" wp14:anchorId="20CC58D0" wp14:editId="5F5D31E0">
+            <wp:extent cx="5943600" cy="3342005"/>
+            <wp:effectExtent l="0" t="0" r="0" b="0"/>
+            <wp:docPr id="505453449" name="Picture 1"/>
+            <wp:cNvGraphicFramePr>
+              <a:graphicFrameLocks xmlns:a="http://schemas.openxmlformats.org/drawingml/2006/main" noChangeAspect="1"/>
+            </wp:cNvGraphicFramePr>
+            <a:graphic xmlns:a="http://schemas.openxmlformats.org/drawingml/2006/main">
+              <a:graphicData uri="http://schemas.openxmlformats.org/drawingml/2006/picture">
+                <pic:pic xmlns:pic="http://schemas.openxmlformats.org/drawingml/2006/picture">
+                  <pic:nvPicPr>
+                    <pic:cNvPr id="505453449" name=""/>
+                    <pic:cNvPicPr/>
+                  </pic:nvPicPr>
+                  <pic:blipFill>
+                    <a:blip r:embed="rId10"/>
+                    <a:stretch>
+                      <a:fillRect/>
+                    </a:stretch>
+                  </pic:blipFill>
+                  <pic:spPr>
+                    <a:xfrm>
+                      <a:off x="0" y="0"/>
+                      <a:ext cx="5943600" cy="3342005"/>
+                    </a:xfrm>
+                    <a:prstGeom prst="rect">
+                      <a:avLst/>
+                    </a:prstGeom>
+                  </pic:spPr>
+                </pic:pic>
+              </a:graphicData>
+            </a:graphic>
+          </wp:inline>
+        </w:drawing>
+      </w:r>
+    </w:p>
+    <w:p>
+      <w:pPr>
+        <w:rPr>
+          <w:b/>
+          <w:bCs/>
+        </w:rPr>
+      </w:pPr>
+      <w:r>
+        <w:rPr>
+          <w:b/>
+          <w:bCs/>
+        </w:rPr>
         <w:t>- Kết quả</w:t>
+      </w:r>
+    </w:p>
+    <w:p>
+      <w:pPr>
+        <w:rPr>
+          <w:b/>
+          <w:bCs/>
+        </w:rPr>
+      </w:pPr>
+      <w:r>
+        <w:rPr>
+          <w:b/>
+          <w:bCs/>
+        </w:rPr>
+        <w:drawing>
+          <wp:inline distT="0" distB="0" distL="0" distR="0" wp14:anchorId="278FC88C" wp14:editId="780389B3">
+            <wp:extent cx="5943600" cy="3342005"/>
+            <wp:effectExtent l="0" t="0" r="0" b="0"/>
+            <wp:docPr id="704306846" name="Picture 1"/>
+            <wp:cNvGraphicFramePr>
+              <a:graphicFrameLocks xmlns:a="http://schemas.openxmlformats.org/drawingml/2006/main" noChangeAspect="1"/>
+            </wp:cNvGraphicFramePr>
+            <a:graphic xmlns:a="http://schemas.openxmlformats.org/drawingml/2006/main">
+              <a:graphicData uri="http://schemas.openxmlformats.org/drawingml/2006/picture">
+                <pic:pic xmlns:pic="http://schemas.openxmlformats.org/drawingml/2006/picture">
+                  <pic:nvPicPr>
+                    <pic:cNvPr id="704306846" name=""/>
+                    <pic:cNvPicPr/>
+                  </pic:nvPicPr>
+                  <pic:blipFill>
+                    <a:blip r:embed="rId11"/>
+                    <a:stretch>
+                      <a:fillRect/>
+                    </a:stretch>
+                  </pic:blipFill>
+                  <pic:spPr>
+                    <a:xfrm>
+                      <a:off x="0" y="0"/>
+                      <a:ext cx="5943600" cy="3342005"/>
+                    </a:xfrm>
+                    <a:prstGeom prst="rect">
+                      <a:avLst/>
+                    </a:prstGeom>
+                  </pic:spPr>
+                </pic:pic>
+              </a:graphicData>
+            </a:graphic>
+          </wp:inline>
+        </w:drawing>
       </w:r>
     </w:p>
     <w:sectPr>

</xml_diff>

<commit_message>
Completed Part 2, Lesson 5
</commit_message>
<xml_diff>
--- a/Minh chứng/Kết quả phần 2 .docx
+++ b/Minh chứng/Kết quả phần 2 .docx
@@ -630,6 +630,172 @@
                   </pic:nvPicPr>
                   <pic:blipFill>
                     <a:blip r:embed="rId11"/>
+                    <a:stretch>
+                      <a:fillRect/>
+                    </a:stretch>
+                  </pic:blipFill>
+                  <pic:spPr>
+                    <a:xfrm>
+                      <a:off x="0" y="0"/>
+                      <a:ext cx="5943600" cy="3342005"/>
+                    </a:xfrm>
+                    <a:prstGeom prst="rect">
+                      <a:avLst/>
+                    </a:prstGeom>
+                  </pic:spPr>
+                </pic:pic>
+              </a:graphicData>
+            </a:graphic>
+          </wp:inline>
+        </w:drawing>
+      </w:r>
+    </w:p>
+    <w:p>
+      <w:pPr>
+        <w:rPr>
+          <w:b/>
+          <w:bCs/>
+        </w:rPr>
+      </w:pPr>
+    </w:p>
+    <w:p>
+      <w:pPr>
+        <w:rPr>
+          <w:b/>
+          <w:bCs/>
+        </w:rPr>
+      </w:pPr>
+      <w:r>
+        <w:rPr>
+          <w:b/>
+          <w:bCs/>
+        </w:rPr>
+        <w:lastRenderedPageBreak/>
+        <w:t xml:space="preserve">Bài </w:t>
+      </w:r>
+      <w:r>
+        <w:rPr>
+          <w:b/>
+          <w:bCs/>
+        </w:rPr>
+        <w:t>5</w:t>
+      </w:r>
+    </w:p>
+    <w:p>
+      <w:pPr>
+        <w:rPr>
+          <w:b/>
+          <w:bCs/>
+        </w:rPr>
+      </w:pPr>
+      <w:r>
+        <w:rPr>
+          <w:b/>
+          <w:bCs/>
+        </w:rPr>
+        <w:t xml:space="preserve">- </w:t>
+      </w:r>
+      <w:r>
+        <w:rPr>
+          <w:b/>
+          <w:bCs/>
+        </w:rPr>
+        <w:t> Khởi động container</w:t>
+      </w:r>
+    </w:p>
+    <w:p>
+      <w:pPr>
+        <w:rPr>
+          <w:b/>
+          <w:bCs/>
+        </w:rPr>
+      </w:pPr>
+      <w:r>
+        <w:rPr>
+          <w:b/>
+          <w:bCs/>
+        </w:rPr>
+        <w:drawing>
+          <wp:inline distT="0" distB="0" distL="0" distR="0" wp14:anchorId="7F1946D9" wp14:editId="3D859312">
+            <wp:extent cx="5943600" cy="3342005"/>
+            <wp:effectExtent l="0" t="0" r="0" b="0"/>
+            <wp:docPr id="983842234" name="Picture 1"/>
+            <wp:cNvGraphicFramePr>
+              <a:graphicFrameLocks xmlns:a="http://schemas.openxmlformats.org/drawingml/2006/main" noChangeAspect="1"/>
+            </wp:cNvGraphicFramePr>
+            <a:graphic xmlns:a="http://schemas.openxmlformats.org/drawingml/2006/main">
+              <a:graphicData uri="http://schemas.openxmlformats.org/drawingml/2006/picture">
+                <pic:pic xmlns:pic="http://schemas.openxmlformats.org/drawingml/2006/picture">
+                  <pic:nvPicPr>
+                    <pic:cNvPr id="983842234" name=""/>
+                    <pic:cNvPicPr/>
+                  </pic:nvPicPr>
+                  <pic:blipFill>
+                    <a:blip r:embed="rId12"/>
+                    <a:stretch>
+                      <a:fillRect/>
+                    </a:stretch>
+                  </pic:blipFill>
+                  <pic:spPr>
+                    <a:xfrm>
+                      <a:off x="0" y="0"/>
+                      <a:ext cx="5943600" cy="3342005"/>
+                    </a:xfrm>
+                    <a:prstGeom prst="rect">
+                      <a:avLst/>
+                    </a:prstGeom>
+                  </pic:spPr>
+                </pic:pic>
+              </a:graphicData>
+            </a:graphic>
+          </wp:inline>
+        </w:drawing>
+      </w:r>
+    </w:p>
+    <w:p>
+      <w:pPr>
+        <w:rPr>
+          <w:b/>
+          <w:bCs/>
+        </w:rPr>
+      </w:pPr>
+      <w:r>
+        <w:rPr>
+          <w:b/>
+          <w:bCs/>
+        </w:rPr>
+        <w:t>- Kết quả</w:t>
+      </w:r>
+    </w:p>
+    <w:p>
+      <w:pPr>
+        <w:rPr>
+          <w:b/>
+          <w:bCs/>
+        </w:rPr>
+      </w:pPr>
+      <w:r>
+        <w:rPr>
+          <w:b/>
+          <w:bCs/>
+        </w:rPr>
+        <w:drawing>
+          <wp:inline distT="0" distB="0" distL="0" distR="0" wp14:anchorId="7AC1BAA6" wp14:editId="255555B0">
+            <wp:extent cx="5943600" cy="3342005"/>
+            <wp:effectExtent l="0" t="0" r="0" b="0"/>
+            <wp:docPr id="961929294" name="Picture 1"/>
+            <wp:cNvGraphicFramePr>
+              <a:graphicFrameLocks xmlns:a="http://schemas.openxmlformats.org/drawingml/2006/main" noChangeAspect="1"/>
+            </wp:cNvGraphicFramePr>
+            <a:graphic xmlns:a="http://schemas.openxmlformats.org/drawingml/2006/main">
+              <a:graphicData uri="http://schemas.openxmlformats.org/drawingml/2006/picture">
+                <pic:pic xmlns:pic="http://schemas.openxmlformats.org/drawingml/2006/picture">
+                  <pic:nvPicPr>
+                    <pic:cNvPr id="961929294" name=""/>
+                    <pic:cNvPicPr/>
+                  </pic:nvPicPr>
+                  <pic:blipFill>
+                    <a:blip r:embed="rId13"/>
                     <a:stretch>
                       <a:fillRect/>
                     </a:stretch>
@@ -1060,7 +1226,7 @@
   <w:style w:type="paragraph" w:default="1" w:styleId="Normal">
     <w:name w:val="Normal"/>
     <w:qFormat/>
-    <w:rsid w:val="00965DFB"/>
+    <w:rsid w:val="0095108A"/>
   </w:style>
   <w:style w:type="paragraph" w:styleId="Heading1">
     <w:name w:val="heading 1"/>

</xml_diff>

<commit_message>
Completed Part 2, Lesson 6
</commit_message>
<xml_diff>
--- a/Minh chứng/Kết quả phần 2 .docx
+++ b/Minh chứng/Kết quả phần 2 .docx
@@ -796,6 +796,172 @@
                   </pic:nvPicPr>
                   <pic:blipFill>
                     <a:blip r:embed="rId13"/>
+                    <a:stretch>
+                      <a:fillRect/>
+                    </a:stretch>
+                  </pic:blipFill>
+                  <pic:spPr>
+                    <a:xfrm>
+                      <a:off x="0" y="0"/>
+                      <a:ext cx="5943600" cy="3342005"/>
+                    </a:xfrm>
+                    <a:prstGeom prst="rect">
+                      <a:avLst/>
+                    </a:prstGeom>
+                  </pic:spPr>
+                </pic:pic>
+              </a:graphicData>
+            </a:graphic>
+          </wp:inline>
+        </w:drawing>
+      </w:r>
+    </w:p>
+    <w:p>
+      <w:pPr>
+        <w:rPr>
+          <w:b/>
+          <w:bCs/>
+        </w:rPr>
+      </w:pPr>
+    </w:p>
+    <w:p>
+      <w:pPr>
+        <w:rPr>
+          <w:b/>
+          <w:bCs/>
+        </w:rPr>
+      </w:pPr>
+      <w:r>
+        <w:rPr>
+          <w:b/>
+          <w:bCs/>
+        </w:rPr>
+        <w:lastRenderedPageBreak/>
+        <w:t xml:space="preserve">Bài </w:t>
+      </w:r>
+      <w:r>
+        <w:rPr>
+          <w:b/>
+          <w:bCs/>
+        </w:rPr>
+        <w:t>6</w:t>
+      </w:r>
+    </w:p>
+    <w:p>
+      <w:pPr>
+        <w:rPr>
+          <w:b/>
+          <w:bCs/>
+        </w:rPr>
+      </w:pPr>
+      <w:r>
+        <w:rPr>
+          <w:b/>
+          <w:bCs/>
+        </w:rPr>
+        <w:t xml:space="preserve">- </w:t>
+      </w:r>
+      <w:r>
+        <w:rPr>
+          <w:b/>
+          <w:bCs/>
+        </w:rPr>
+        <w:t> Khởi động container</w:t>
+      </w:r>
+    </w:p>
+    <w:p>
+      <w:pPr>
+        <w:rPr>
+          <w:b/>
+          <w:bCs/>
+        </w:rPr>
+      </w:pPr>
+      <w:r>
+        <w:rPr>
+          <w:b/>
+          <w:bCs/>
+        </w:rPr>
+        <w:drawing>
+          <wp:inline distT="0" distB="0" distL="0" distR="0" wp14:anchorId="3C38906C" wp14:editId="582521DE">
+            <wp:extent cx="5943600" cy="3342005"/>
+            <wp:effectExtent l="0" t="0" r="0" b="0"/>
+            <wp:docPr id="1088679364" name="Picture 1"/>
+            <wp:cNvGraphicFramePr>
+              <a:graphicFrameLocks xmlns:a="http://schemas.openxmlformats.org/drawingml/2006/main" noChangeAspect="1"/>
+            </wp:cNvGraphicFramePr>
+            <a:graphic xmlns:a="http://schemas.openxmlformats.org/drawingml/2006/main">
+              <a:graphicData uri="http://schemas.openxmlformats.org/drawingml/2006/picture">
+                <pic:pic xmlns:pic="http://schemas.openxmlformats.org/drawingml/2006/picture">
+                  <pic:nvPicPr>
+                    <pic:cNvPr id="1088679364" name=""/>
+                    <pic:cNvPicPr/>
+                  </pic:nvPicPr>
+                  <pic:blipFill>
+                    <a:blip r:embed="rId14"/>
+                    <a:stretch>
+                      <a:fillRect/>
+                    </a:stretch>
+                  </pic:blipFill>
+                  <pic:spPr>
+                    <a:xfrm>
+                      <a:off x="0" y="0"/>
+                      <a:ext cx="5943600" cy="3342005"/>
+                    </a:xfrm>
+                    <a:prstGeom prst="rect">
+                      <a:avLst/>
+                    </a:prstGeom>
+                  </pic:spPr>
+                </pic:pic>
+              </a:graphicData>
+            </a:graphic>
+          </wp:inline>
+        </w:drawing>
+      </w:r>
+    </w:p>
+    <w:p>
+      <w:pPr>
+        <w:rPr>
+          <w:b/>
+          <w:bCs/>
+        </w:rPr>
+      </w:pPr>
+      <w:r>
+        <w:rPr>
+          <w:b/>
+          <w:bCs/>
+        </w:rPr>
+        <w:t>- Kết quả</w:t>
+      </w:r>
+    </w:p>
+    <w:p>
+      <w:pPr>
+        <w:rPr>
+          <w:b/>
+          <w:bCs/>
+        </w:rPr>
+      </w:pPr>
+      <w:r>
+        <w:rPr>
+          <w:b/>
+          <w:bCs/>
+        </w:rPr>
+        <w:drawing>
+          <wp:inline distT="0" distB="0" distL="0" distR="0" wp14:anchorId="6E953E19" wp14:editId="5478A2E4">
+            <wp:extent cx="5943600" cy="3342005"/>
+            <wp:effectExtent l="0" t="0" r="0" b="0"/>
+            <wp:docPr id="941074121" name="Picture 1"/>
+            <wp:cNvGraphicFramePr>
+              <a:graphicFrameLocks xmlns:a="http://schemas.openxmlformats.org/drawingml/2006/main" noChangeAspect="1"/>
+            </wp:cNvGraphicFramePr>
+            <a:graphic xmlns:a="http://schemas.openxmlformats.org/drawingml/2006/main">
+              <a:graphicData uri="http://schemas.openxmlformats.org/drawingml/2006/picture">
+                <pic:pic xmlns:pic="http://schemas.openxmlformats.org/drawingml/2006/picture">
+                  <pic:nvPicPr>
+                    <pic:cNvPr id="941074121" name=""/>
+                    <pic:cNvPicPr/>
+                  </pic:nvPicPr>
+                  <pic:blipFill>
+                    <a:blip r:embed="rId15"/>
                     <a:stretch>
                       <a:fillRect/>
                     </a:stretch>
@@ -1226,7 +1392,7 @@
   <w:style w:type="paragraph" w:default="1" w:styleId="Normal">
     <w:name w:val="Normal"/>
     <w:qFormat/>
-    <w:rsid w:val="0095108A"/>
+    <w:rsid w:val="00E80472"/>
   </w:style>
   <w:style w:type="paragraph" w:styleId="Heading1">
     <w:name w:val="heading 1"/>

</xml_diff>